<commit_message>
Apply review fixes: significance marks, figure/table citations, references, typos, landscape appendix
Co-Authored-By: Claude Opus 5.5 <noreply@anthropic.com>
Claude-Session: https://claude.ai/code/session_01Mr5vHFAEvsGoTDLMY2BMvt
</commit_message>
<xml_diff>
--- a/JCR_도덕경_골프퍼포먼스_템플릿적용.docx
+++ b/JCR_도덕경_골프퍼포먼스_템플릿적용.docx
@@ -144,11 +144,10 @@
       </w:r>
       <w:r>
         <w:rPr>
-          <w:color w:val="0000FF"/>
           <w:sz w:val="19"/>
           <w:szCs w:val="19"/>
         </w:rPr>
-        <w:t xml:space="preserve">도덕경, 허정, 골프 퍼포먼스 (원고에 주제어가 없어 제안한 값입니다. 확인 후 수정하십시오)</w:t>
+        <w:t xml:space="preserve">도덕경, 허정, 골프 퍼포먼스</w:t>
       </w:r>
     </w:p>
     <w:p>
@@ -207,11 +206,10 @@
       </w:r>
       <w:r>
         <w:rPr>
-          <w:color w:val="0000FF"/>
           <w:sz w:val="19"/>
           <w:szCs w:val="19"/>
         </w:rPr>
-        <w:t xml:space="preserve">Tao Te Ching, Emptiness, Golf Performance (제안 값, 확인 필요)</w:t>
+        <w:t xml:space="preserve">Tao Te Ching, Emptiness, Golf Performance</w:t>
       </w:r>
     </w:p>
     <w:p>
@@ -349,7 +347,7 @@
         </w:rPr>
       </w:pPr>
       <w:r>
-        <w:t xml:space="preserve">최근 스포츠 심리학 분야에서는 마음챙김(Mindfulness)과 몰입(Flow)이 운동 수행 향상과 밀접한 관련이 있다는 연구들이 다수 보고되고 있다.</w:t>
+        <w:t xml:space="preserve">최근 스포츠 심리학 분야에서는 마음챙김(Mindfulness)과 몰입(Flow; Csikszentmihalyi, 1990)이 운동 수행 향상과 밀접한 관련이 있다는 연구들이 다수 보고되고 있다.</w:t>
       </w:r>
     </w:p>
     <w:p>
@@ -492,7 +490,7 @@
         <w:rPr>
           <w:b/>
         </w:rPr>
-        <w:t xml:space="preserve">무위((Wu-wei):</w:t>
+        <w:t xml:space="preserve">무위(Wu-wei):</w:t>
       </w:r>
       <w:r>
         <w:t xml:space="preserve"> 억지로 결과를 만들어내려 하기보다 흐름에 맡기고, 실수를 있는 그대로 받아들이는 태도.</w:t>
@@ -864,6 +862,9 @@
       <w:r>
         <w:t xml:space="preserve">를 산출하였으며, 일반적으로 α 값이 0.70 이상일 경우 측정 도구(설문)의 신뢰도가 수용 가능한 수준으로 판단한다. '최근 1년 평균 타수'와 '전체 구력 기준 핸디캡'은 종속변수로 설정하였다.</w:t>
       </w:r>
+      <w:r>
+        <w:t xml:space="preserve"> 전체 설문 응답 자료는 부록 A(그림 A1)에 제시하였다.</w:t>
+      </w:r>
     </w:p>
     <w:p>
       <w:pPr>
@@ -987,7 +988,7 @@
         <w:t xml:space="preserve">Cronbach’s α 계수</w:t>
       </w:r>
       <w:r>
-        <w:t xml:space="preserve">를 산출하였으며, 일반적으로 α 값이 0.70 이상일 경우 측정 도구(설문)의 신뢰도가 수용 가능한 수준으로 판단한다. 본 연구에서 무위(.842), 유약(.458), 허정(.626), 플로우(.759) 의 결과를 얻었으며, 무위(α=.842)와 플로우(α=.759)는 수용 가능한 수준의 내적 일관성을 보였다. 허정(α=.626)은 탐색적 연구에서는 제한적으로 해석 가능한 수준으로 판단되며, 유약(α=.458)은 상대적으로 낮은 신뢰도를 나타내었다. 이는 해당 구성개념을 측정하는 문항 간 내적 일관성이 충분히 확보되지 않았음을 의미한다. 따라서 유약 변수에 대한 통계적 결과는 해석 시 신중한 접근이 필요하며, 향후 연구에서는 보다 정교한 문항 설계 및 척도 개선이 요구된다.</w:t>
+        <w:t xml:space="preserve">를 산출하였으며, 일반적으로 α 값이 0.70 이상일 경우 측정 도구(설문)의 신뢰도가 수용 가능한 수준으로 판단한다. 본 연구에서 무위(.842), 유약(.458), 허정(.626), 플로우(.759)의 결과를 얻었으며(표 1), 무위(α=.842)와 플로우(α=.759)는 수용 가능한 수준의 내적 일관성을 보였다. 허정(α=.626)은 탐색적 연구에서는 제한적으로 해석 가능한 수준으로 판단되며, 유약(α=.458)은 상대적으로 낮은 신뢰도를 나타내었다. 이는 해당 구성개념을 측정하는 문항 간 내적 일관성이 충분히 확보되지 않았음을 의미한다. 따라서 유약 변수에 대한 통계적 결과는 해석 시 신중한 접근이 필요하며, 향후 연구에서는 보다 정교한 문항 설계 및 척도 개선이 요구된다.</w:t>
       </w:r>
     </w:p>
     <w:p>
@@ -1837,7 +1838,7 @@
         </w:rPr>
       </w:pPr>
       <w:r>
-        <w:t xml:space="preserve">본격적인 가설 검정에 앞서, 수집된 표본의 전반적인 특성을 파악하기 위해 기술통계를 산출하였다. 실력 수준별 분포를 세분화하여 살펴보면, 비기너(100타 이상) 9명, 중급자(90타대) 29명, 고수(70~80대 타수) 30명, 티칭 프로 3명, 투어 프로 4명으로 구성되었다.</w:t>
+        <w:t xml:space="preserve">본격적인 가설 검정에 앞서, 수집된 표본의 전반적인 특성을 파악하기 위해 기술통계를 산출하였다. 실력 수준별 분포를 세분화하여 살펴보면, 비기너(100타 이상) 9명, 중급자(90타대) 29명, 고수(70~80대 타수) 30명, 티칭 프로 3명, 투어 프로 4명으로 구성되었다(그림 1).</w:t>
       </w:r>
     </w:p>
     <w:p>
@@ -1945,7 +1946,7 @@
         </w:rPr>
       </w:pPr>
       <w:r>
-        <w:t xml:space="preserve">응답자의 평균 골프 구력은 12.05년(SD=8.51)이었으며, 최근 1년 평균 타수는 90.25타(SD=8.79), 평균 핸디캡은 16.36(SD=7.21)으로 나타났다. 퍼포먼스 보조 지표인 '최근 10경기 결과'는 척도 방향이 설문 원문만으로 명확히 정의되지 않아, 본 연구에서는 보조적 지표로만 한정하여 분석하였다. 도덕경 관련 합성지수의 평균은 무위 3.65(SD=1.16), 유약 3.41(SD=0.91), 허정 2.87(SD=1.03)이었다</w:t>
+        <w:t xml:space="preserve">응답자의 평균 골프 구력은 12.05년(SD=8.51)이었으며, 최근 1년 평균 타수는 90.25타(SD=8.79), 평균 핸디캡은 16.36(SD=7.21)으로 나타났다. 퍼포먼스 보조 지표인 '최근 10경기 결과'는 척도 방향이 설문 원문만으로 명확히 정의되지 않아, 본 연구에서는 보조적 지표로만 한정하여 분석하였다. 도덕경 관련 합성지수의 평균은 무위 3.65(SD=1.16), 유약 3.41(SD=0.91), 허정 2.87(SD=1.03)이었다(표 2)</w:t>
       </w:r>
     </w:p>
     <w:p>
@@ -3965,7 +3966,7 @@
         </w:rPr>
       </w:pPr>
       <w:r>
-        <w:t xml:space="preserve">위 표의 통계치를 통해 볼 때, 응답자들은 비교적 흐름에 맡기기(무위)와 부드럽게 대응하기(유약)는 어느 정도 실천하고 있지만, 결과에 대한 잡념을 완전히 비우고 고요하게 유지하는 '허정'의 상태는 상대적으로 덜 경험하고 있는 것으로 확인되었다. 이는 Kee et al.(2021)의 참고 논문에서 무위(Wu-wei)를 결과 집착을 줄이고 자연스러운 흐름을 따르는 태도로 설명하는 논의와도 잘 부합하는 현상이다.</w:t>
+        <w:t xml:space="preserve">표 2의 통계치를 통해 볼 때, 응답자들은 비교적 흐름에 맡기기(무위)와 부드럽게 대응하기(유약)는 어느 정도 실천하고 있지만, 결과에 대한 잡념을 완전히 비우고 고요하게 유지하는 '허정'의 상태는 상대적으로 덜 경험하고 있는 것으로 확인되었다. 이는 Kee et al.(2021)의 참고 논문에서 무위(Wu-wei)를 결과 집착을 줄이고 자연스러운 흐름을 따르는 태도로 설명하는 논의와도 잘 부합하는 현상이다.</w:t>
       </w:r>
     </w:p>
     <w:p>
@@ -4039,7 +4040,7 @@
         <w:t xml:space="preserve">U자형 경향 </w:t>
       </w:r>
       <w:r>
-        <w:t xml:space="preserve">추이를 나타냈다. 이는 향후 표본 확보를 통한 후속 연구에서 탐색적으로 검증될 필요가 있다.</w:t>
+        <w:t xml:space="preserve">추이를 나타냈다(그림 2). 이는 향후 표본 확보를 통한 후속 연구에서 탐색적으로 검증될 필요가 있다.</w:t>
       </w:r>
     </w:p>
     <w:p>
@@ -4132,7 +4133,7 @@
         </w:rPr>
       </w:pPr>
       <w:r>
-        <w:t xml:space="preserve">둘째, 실력 수준이 비기너에서 투어 프로 집단으로 증가할수록, 샷 직전 잡념을 비우는 ‘허정(Emptiness)’ 점수는 전반적으로 완만한 증가 경향을 보이는 양상이 관찰되었다. 그러나 본 연구에서는 통계적 유의수준(p &lt; 0.05)을 충족하지 못하였으므로, 이러한 변화는 통계적으로 유의한 증가로 해석하기에는 제한이 있다. 다만 실력 수준에 따라 점진적인 변화 양상이 나타난 점은 향후 추가 표본 확보를 통한 후속 연구에서 탐색적으로 검증될 필요가 있다.</w:t>
+        <w:t xml:space="preserve">둘째, 실력 수준이 비기너에서 투어 프로 집단으로 증가할수록, 샷 직전 잡념을 비우는 ‘허정(Emptiness)’ 점수는 전반적으로 완만한 증가 경향을 보이는 양상이 관찰되었다(그림 3). 그러나 본 연구에서는 통계적 유의수준(p &lt; 0.05)을 충족하지 못하였으므로, 이러한 변화는 통계적으로 유의한 증가로 해석하기에는 제한이 있다. 다만 실력 수준에 따라 점진적인 변화 양상이 나타난 점은 향후 추가 표본 확보를 통한 후속 연구에서 탐색적으로 검증될 필요가 있다.</w:t>
       </w:r>
     </w:p>
     <w:p>
@@ -4145,7 +4146,7 @@
         </w:rPr>
       </w:pPr>
       <w:r>
-        <w:t xml:space="preserve">셋째, 무아지경 상태를 의미하는 ‘플로우(Flow)’ 점수 역시 실력 수준이 증가함에 따라 전반적으로 상승하는 경향을 보이는 양상이 관찰되었다. 그러나 이러한 변화 또한 통계적으로 유의한 수준에는 도달하지 못하였으므로, 결과 해석에는 신중한 접근이 필요하다. 그럼에도 불구하고 실력 수준에 따라 일정한 변화 양상이 나타난 점은 향후 후속 연구에서 추가적으로 탐색해 볼 수 있는 가능성을 제시한다.</w:t>
+        <w:t xml:space="preserve">셋째, 무아지경 상태를 의미하는 ‘플로우(Flow)’ 점수 역시 실력 수준이 증가함에 따라 전반적으로 상승하는 경향을 보이는 양상이 관찰되었다(그림 4). 그러나 이러한 변화 또한 통계적으로 유의한 수준에는 도달하지 못하였으므로, 결과 해석에는 신중한 접근이 필요하다. 그럼에도 불구하고 실력 수준에 따라 일정한 변화 양상이 나타난 점은 향후 후속 연구에서 추가적으로 탐색해 볼 수 있는 가능성을 제시한다.</w:t>
       </w:r>
     </w:p>
     <w:p>
@@ -4428,7 +4429,7 @@
         <w:t xml:space="preserve">허정 수준이 낮은 집단의 평균 타수는 93.11타였으나, 높은 집단의 평균 타수는 87.75타</w:t>
       </w:r>
       <w:r>
-        <w:t xml:space="preserve">로 무려 5.36타의 차이를 보였다. 평균 핸디캡 역시 허정이 낮은 집단은 18.00, 높은 집단은 14.93으로 나타났다.</w:t>
+        <w:t xml:space="preserve">로 무려 5.36타의 차이를 보였다. 평균 핸디캡 역시 허정이 낮은 집단은 18.00, 높은 집단은 14.93으로 나타났다(표 4).</w:t>
       </w:r>
     </w:p>
     <w:p>
@@ -4441,7 +4442,7 @@
         </w:rPr>
       </w:pPr>
       <w:r>
-        <w:t xml:space="preserve">분석 결과를 종합하면, 흐름에 맡기는 '무위'나 부드러움을 뜻하는 '유약'은 본 표본 내에서 핵심 퍼포먼스 지표(평균 타수 및 핸디캡)와 뚜렷한 선형적 관련성을 보이지 않았다. 반면, 샷 직전에 잡념을 비우고 고요함을 유지하는 '허정(Emptiness)'은 평균 타수(r = -0.237, p = 0.041) 및 핸디캡(r = -0.253, p = 0.029) 모두와 유의미한 음(-)의 상관관계를 나타냈다. 두 지표의 P-value가 모두 유의수준 0.05 미만으로 도출됨에 따라, '허정'의 태도를 잘 실천하는 골퍼일수록 실제 타수와 핸디캡이 낮아지는(실력이 뛰어난) 일관된 경향성이 확인 되었다. 단, 본 연구는 자기보고식 설문에 기초한 횡단면 자료(Cross-sectional data)를 활용하였으므로, 이러한 통계적 결과를 명확한 인과관계(Causal effects)로 단정하기보다는 변수 간의 유의미한관련성(Associations)으로 해석하는 것이 타당하다</w:t>
+        <w:t xml:space="preserve">분석 결과를 종합하면, 흐름에 맡기는 '무위'나 부드러움을 뜻하는 '유약'은 본 표본 내에서 핵심 퍼포먼스 지표(평균 타수 및 핸디캡)와 뚜렷한 선형적 관련성을 보이지 않았다. 반면, 샷 직전에 잡념을 비우고 고요함을 유지하는 '허정(Emptiness)'은 평균 타수(r = -0.237, p = 0.041) 및 핸디캡(r = -0.253, p = 0.029) 모두와 유의미한 음(-)의 상관관계를 나타냈다(표 3). 두 지표의 P-value가 모두 유의수준 0.05 미만으로 도출됨에 따라, '허정'의 태도를 잘 실천하는 골퍼일수록 실제 타수와 핸디캡이 낮아지는(실력이 뛰어난) 일관된 경향성이 확인되었다. 단, 본 연구는 자기보고식 설문에 기초한 횡단면 자료(Cross-sectional data)를 활용하였으므로, 이러한 통계적 결과를 명확한 인과관계(Causal effects)로 단정하기보다는 변수 간의 유의미한 관련성(Associations)으로 해석하는 것이 타당하다.</w:t>
       </w:r>
     </w:p>
     <w:p>
@@ -4908,7 +4909,7 @@
                 <w:spacing w:val="-6"/>
                 <w:w w:val="95"/>
               </w:rPr>
-              <w:t xml:space="preserve">유의함 (p&lt;0.05)</w:t>
+              <w:t xml:space="preserve">유의함* (p&lt;0.05)</w:t>
             </w:r>
           </w:p>
         </w:tc>
@@ -4926,7 +4927,7 @@
           <w:rFonts w:ascii="HY중고딕" w:eastAsia="HY중고딕" w:hAnsi="HY중고딕" w:hint="default"/>
           <w:i/>
         </w:rPr>
-        <w:t xml:space="preserve">주(Note): * p &lt; .05, p &lt; .01 (Pearson 상관계수 적용)</w:t>
+        <w:t xml:space="preserve">주(Note): * p &lt; .05, ** p &lt; .01 (Pearson 상관계수 적용)</w:t>
       </w:r>
     </w:p>
     <w:p>
@@ -5400,7 +5401,7 @@
         </w:rPr>
       </w:pPr>
       <w:r>
-        <w:t xml:space="preserve">상관관계 분석을 넘어, 독립변수들이 핸디캡에 미치는 복합적이고 독립적인 영향력을 산출하기 위해 OLS 다중회귀분석(Multiple Regression)을 실시하였다.</w:t>
+        <w:t xml:space="preserve">상관관계 분석을 넘어, 독립변수들이 핸디캡에 미치는 복합적이고 독립적인 영향력을 산출하기 위해 OLS 다중회귀분석(Multiple Regression)을 실시하였다(표 5).</w:t>
       </w:r>
     </w:p>
     <w:p>
@@ -5792,7 +5793,7 @@
                 <w:spacing w:val="-6"/>
                 <w:w w:val="95"/>
               </w:rPr>
-              <w:t xml:space="preserve">&lt; .001</w:t>
+              <w:t xml:space="preserve">&lt; .001***</w:t>
             </w:r>
           </w:p>
         </w:tc>
@@ -5924,7 +5925,7 @@
                 <w:spacing w:val="-6"/>
                 <w:w w:val="95"/>
               </w:rPr>
-              <w:t xml:space="preserve">0.017</w:t>
+              <w:t xml:space="preserve">0.017*</w:t>
             </w:r>
           </w:p>
         </w:tc>
@@ -6245,13 +6246,13 @@
           <w:rFonts w:ascii="HY중고딕" w:eastAsia="HY중고딕" w:hAnsi="HY중고딕" w:hint="default"/>
           <w:i/>
         </w:rPr>
-        <w:t xml:space="preserve">R² = 0.433, Adjusted R² = 0.401 , F = 13.38 , N = 75</w:t>
+        <w:t xml:space="preserve">R² = 0.433, Adjusted R² = 0.401, F = 13.38, N = 75</w:t>
       </w:r>
       <w:r>
         <w:rPr>
           <w:rFonts w:ascii="HY중고딕" w:eastAsia="HY중고딕" w:hAnsi="HY중고딕" w:hint="default"/>
         </w:rPr>
-        <w:t xml:space="preserve"> ** p &lt; .001</w:t>
+        <w:t xml:space="preserve"> . * p &lt; .05, ** p &lt; .01, *** p &lt; .001</w:t>
       </w:r>
     </w:p>
     <w:p>
@@ -6336,7 +6337,7 @@
         <w:rPr>
           <w:b/>
         </w:rPr>
-        <w:t xml:space="preserve">'허정(Emptiness)'의 태도는 골프 퍼포먼스와 유의마한 통계적 관련성</w:t>
+        <w:t xml:space="preserve">'허정(Emptiness)'의 태도는 골프 퍼포먼스와 유의미한 통계적 관련성</w:t>
       </w:r>
       <w:r>
         <w:t xml:space="preserve">을 보였다. 실력이 상급자로 갈수록 허정을 실천하는 빈도가 뚜렷하게 증가하였으며, 평균 타수 및 핸디캡 모두와 유의미한 음(-)의 상관관계를 나타냈다. 특히, 핸디캡에 가장 결정적인 영향을 미치는 물리적 요인인 '구력(경험)'을 통제한 다중회귀분석에서도 허정은 핸디캡을 유의미하게 낮추는 독립 변인으로 확인되었다(허정 점수 1점 상승 시 핸디캡 약 2.69타 감소). 이는 동양철학의 '비움'이라는 추상적 개념이 실제 스포츠 현장에서 타수를 줄이는 구체적이고 강력한 멘탈리티 전략임을 데이터를 통해 유의미한 관련성이 관찰되었다는 점에서 의의가 있다.</w:t>
@@ -6511,7 +6512,7 @@
         <w:t xml:space="preserve">회귀모델의 설명력과 누락 변수(Omitted Variables)의 한계:</w:t>
       </w:r>
       <w:r>
-        <w:t xml:space="preserve"> 다중회귀분석 결과 모델의 결정계수(R^2)가 43.3%로 도출되어 통계적으로 양호한 설명력을 보였으나, 이는 곧 핸디캡 분산의 나머지 56.7%는 본 연구에 포함되지 않은 다른 요인에 의해 설명됨을 의미한다. 향후 연구에서는 주당 연습 시간, 라운딩 빈도, 신체 근력 등 퍼포먼스에 영향을 미칠 수 있는 다양한 독립변수들을 추가로 통제하여 보다 정교한 회귀모델을 구축할 필요가 있다.</w:t>
+        <w:t xml:space="preserve"> 다중회귀분석 결과 모델의 결정계수(R²)가 43.3%로 도출되어 통계적으로 양호한 설명력을 보였으나, 이는 곧 핸디캡 분산의 나머지 56.7%는 본 연구에 포함되지 않은 다른 요인에 의해 설명됨을 의미한다. 향후 연구에서는 주당 연습 시간, 라운딩 빈도, 신체 근력 등 퍼포먼스에 영향을 미칠 수 있는 다양한 독립변수들을 추가로 통제하여 보다 정교한 회귀모델을 구축할 필요가 있다.</w:t>
       </w:r>
     </w:p>
     <w:p>
@@ -6523,6 +6524,18 @@
         <w:rPr>
           <w:rFonts w:hint="default"/>
         </w:rPr>
+        <w:sectPr>
+          <w:headerReference w:type="default" r:id="rId9"/>
+          <w:headerReference w:type="first" r:id="rId10"/>
+          <w:footerReference w:type="first" r:id="rId11"/>
+          <w:type w:val="continuous"/>
+          <w:pgSz w:w="11906" w:h="16838" w:code="9"/>
+          <w:pgMar w:top="1417" w:right="720" w:bottom="907" w:left="720" w:header="720" w:footer="612" w:gutter="0"/>
+          <w:pgNumType w:start="1"/>
+          <w:cols w:space="720"/>
+          <w:titlePg/>
+          <w:docGrid w:type="lines" w:linePitch="326"/>
+        </w:sectPr>
       </w:pPr>
       <w:r>
         <w:t xml:space="preserve">• </w:t>
@@ -6576,7 +6589,7 @@
       <w:r>
         <w:drawing>
           <wp:inline xmlns:a="http://schemas.openxmlformats.org/drawingml/2006/main" xmlns:pic="http://schemas.openxmlformats.org/drawingml/2006/picture">
-            <wp:extent cx="4989195" cy="3074330"/>
+            <wp:extent cx="7937500" cy="4891069"/>
             <wp:docPr id="2004" name="Picture 1028"/>
             <wp:cNvGraphicFramePr>
               <a:graphicFrameLocks noChangeAspect="1"/>
@@ -6597,7 +6610,7 @@
                   <pic:spPr>
                     <a:xfrm>
                       <a:off x="0" y="0"/>
-                      <a:ext cx="4989195" cy="3074330"/>
+                      <a:ext cx="7937500" cy="4891069"/>
                     </a:xfrm>
                     <a:prstGeom prst="rect"/>
                   </pic:spPr>
@@ -6615,6 +6628,14 @@
         <w:rPr>
           <w:rFonts w:hint="default"/>
         </w:rPr>
+        <w:sectPr>
+          <w:headerReference w:type="default" r:id="rId9"/>
+          <w:type w:val="nextPage"/>
+          <w:pgSz w:w="16838" w:h="11906" w:code="9" w:orient="landscape"/>
+          <w:pgMar w:top="1417" w:right="720" w:bottom="907" w:left="720" w:header="720" w:footer="612" w:gutter="0"/>
+          <w:cols w:space="720"/>
+          <w:docGrid w:type="lines" w:linePitch="326"/>
+        </w:sectPr>
       </w:pPr>
       <w:r>
         <w:rPr>
@@ -6711,7 +6732,7 @@
         <w:rPr>
           <w:rFonts w:cs="맑은 고딕"/>
         </w:rPr>
-        <w:t xml:space="preserve">박영신, 김의철. (2009). 한국인의 스포츠 수행과 몰입 경험에 대한 심리학적 분석. 한국심리학회지, 15(1), 241–250.</w:t>
+        <w:t xml:space="preserve">Bernier, M., Thienot, E., Codron, R., &amp; Fournier, J. (2009). Mindfulness and acceptance approaches in sport performance. Journal of Clinical Sport Psychology, 3(4), 320–333. https://doi.org/10.1123/jcsp.3.4.320</w:t>
       </w:r>
     </w:p>
     <w:p>
@@ -6731,7 +6752,7 @@
         <w:rPr>
           <w:rFonts w:cs="맑은 고딕"/>
         </w:rPr>
-        <w:t xml:space="preserve">Bernier, M., Thienot, E., Codron, R., &amp; Fournier, J. (2009). Mindfulness and acceptance approaches in sport performance. Journal of Clinical Sport Psychology, 3(4), 320–333. https://doi.org/10.1123/jcsp.3.4.320</w:t>
+        <w:t xml:space="preserve">Brown, K. W., &amp; Ryan, R. M. (2003). The benefits of being present: Mindfulness and its role in psychological well-being. Journal of Personality and Social Psychology, 84(4), 822–848. https://doi.org/10.1037/0022-3514.84.4.822</w:t>
       </w:r>
     </w:p>
     <w:p>
@@ -6751,7 +6772,7 @@
         <w:rPr>
           <w:rFonts w:cs="맑은 고딕"/>
         </w:rPr>
-        <w:t xml:space="preserve">Brown, K. W., &amp; Ryan, R. M. (2003). The benefits of being present: Mindfulness and its role in psychological well-being. Journal of Personality and Social Psychology, 84(4), 822–848. https://doi.org/10.1037/0022-3514.84.4.822</w:t>
+        <w:t xml:space="preserve">Csikszentmihalyi, M. (1990). Flow: The psychology of optimal experience. Harper &amp; Row.</w:t>
       </w:r>
     </w:p>
     <w:p>
@@ -6771,7 +6792,7 @@
         <w:rPr>
           <w:rFonts w:cs="맑은 고딕"/>
         </w:rPr>
-        <w:t xml:space="preserve">Csikszentmihalyi, M. (1990). Flow: The psychology of optimal experience. Harper &amp; Row.</w:t>
+        <w:t xml:space="preserve">Gardner, F. L., &amp; Moore, Z. E. (2007). The psychology of enhancing human performance: The mindfulness-acceptance-commitment approach. Springer.</w:t>
       </w:r>
     </w:p>
     <w:p>
@@ -6791,7 +6812,7 @@
         <w:rPr>
           <w:rFonts w:cs="맑은 고딕"/>
         </w:rPr>
-        <w:t xml:space="preserve">Gardner, F. L., &amp; Moore, Z. E. (2007). The psychology of enhancing human performance: The mindfulness-acceptance-commitment approach. Springer.</w:t>
+        <w:t xml:space="preserve">Jackson, S. A., &amp; Csikszentmihalyi, M. (1999). Flow in sports: The keys to optimal experiences and performances. Human Kinetics.</w:t>
       </w:r>
     </w:p>
     <w:p>
@@ -6811,7 +6832,7 @@
         <w:rPr>
           <w:rFonts w:cs="맑은 고딕"/>
         </w:rPr>
-        <w:t xml:space="preserve">Jackson, S. A., &amp; Csikszentmihalyi, M. (1999). Flow in sports: The keys to optimal experiences and performances. Human Kinetics.</w:t>
+        <w:t xml:space="preserve">Kabat-Zinn, J. (2003). Mindfulness-based interventions in context: Past, present, and future. Clinical Psychology: Science and Practice, 10(2), 144–156. https://doi.org/10.1093/clipsy.bpg016</w:t>
       </w:r>
     </w:p>
     <w:p>
@@ -6831,7 +6852,7 @@
         <w:rPr>
           <w:rFonts w:cs="맑은 고딕"/>
         </w:rPr>
-        <w:t xml:space="preserve">Kabat-Zinn, J. (2003). Mindfulness-based interventions in context: Past, present, and future. Clinical Psychology: Science and Practice, 10(2), 144–156. https://doi.org/10.1093/clipsy.bpg016</w:t>
+        <w:t xml:space="preserve">Kee, Y. H., Li, C., Zhang, C. Q., &amp; Wang, J. C. K. (2021). The wu-wei alternative: Effortless action and non-striving in the context of mindfulness practice and performance in sport. Asian Journal of Sport and Exercise Psychology, 1(2), 122–132. https://doi.org/10.1016/j.ajsep.2021.03.001</w:t>
       </w:r>
     </w:p>
     <w:p>
@@ -6851,39 +6872,15 @@
         <w:rPr>
           <w:rFonts w:cs="맑은 고딕"/>
         </w:rPr>
-        <w:t xml:space="preserve">Kee, Y. H., Li, C., Zhang, C. Q., &amp; Wang, J. C. K. (2021). The wu-wei alternative: Effortless action and non-striving in the context of mindfulness practice and performance in sport. Asian Journal of Sport and Exercise Psychology, 1(2), 122–132. https://doi.org/10.1016/j.ajsep.2021.03.001</w:t>
-      </w:r>
-    </w:p>
-    <w:p>
-      <w:pPr>
-        <w:pStyle w:val="MDPI81references"/>
-        <w:numPr>
-          <w:ilvl w:val="0"/>
-          <w:numId w:val="0"/>
-        </w:numPr>
-        <w:ind w:left="428" w:hanging="9"/>
-        <w:rPr>
-          <w:rFonts w:cs="맑은 고딕" w:hint="default"/>
-          <w:lang w:val="it-IT"/>
-        </w:rPr>
-      </w:pPr>
-      <w:r>
-        <w:rPr>
-          <w:rFonts w:cs="맑은 고딕"/>
-        </w:rPr>
-        <w:t xml:space="preserve">대한골프협회. (n.d.). 대한골프협회 홈페이지. http://www.kgagolf.or.kr/</w:t>
+        <w:t xml:space="preserve">Laozi. (2010). Dodeokgyeong [Tao Te Ching] (K.-N. Oh, Trans.). Hyeonamsa.</w:t>
       </w:r>
     </w:p>
     <w:sectPr>
       <w:headerReference w:type="default" r:id="rId9"/>
-      <w:headerReference w:type="first" r:id="rId10"/>
-      <w:footerReference w:type="first" r:id="rId11"/>
-      <w:type w:val="continuous"/>
+      <w:type w:val="nextPage"/>
       <w:pgSz w:w="11906" w:h="16838" w:code="9"/>
       <w:pgMar w:top="1417" w:right="720" w:bottom="907" w:left="720" w:header="720" w:footer="612" w:gutter="0"/>
-      <w:pgNumType w:start="1"/>
       <w:cols w:space="720"/>
-      <w:titlePg/>
       <w:docGrid w:type="lines" w:linePitch="326"/>
     </w:sectPr>
   </w:body>

</xml_diff>

<commit_message>
Re-run analyses from raw survey data: fix Table 5, skill distribution, and regenerate Figures 1-4
Co-Authored-By: Claude Opus 5.5 <noreply@anthropic.com>
Claude-Session: https://claude.ai/code/session_01Mr5vHFAEvsGoTDLMY2BMvt
</commit_message>
<xml_diff>
--- a/JCR_도덕경_골프퍼포먼스_템플릿적용.docx
+++ b/JCR_도덕경_골프퍼포먼스_템플릿적용.docx
@@ -1838,7 +1838,7 @@
         </w:rPr>
       </w:pPr>
       <w:r>
-        <w:t xml:space="preserve">본격적인 가설 검정에 앞서, 수집된 표본의 전반적인 특성을 파악하기 위해 기술통계를 산출하였다. 실력 수준별 분포를 세분화하여 살펴보면, 비기너(100타 이상) 9명, 중급자(90타대) 29명, 고수(70~80대 타수) 30명, 티칭 프로 3명, 투어 프로 4명으로 구성되었다(그림 1).</w:t>
+        <w:t xml:space="preserve">본격적인 가설 검정에 앞서, 수집된 표본의 전반적인 특성을 파악하기 위해 기술통계를 산출하였다. 실력 수준별 분포를 세분화하여 살펴보면, 비기너(100타 이상) 17명, 중급자(90타대) 36명, 고수(70~80대 타수) 15명, 티칭 프로 3명, 투어 프로 4명으로 구성되었다(그림 1).</w:t>
       </w:r>
     </w:p>
     <w:p>
@@ -1852,7 +1852,7 @@
       <w:r>
         <w:drawing>
           <wp:inline xmlns:a="http://schemas.openxmlformats.org/drawingml/2006/main" xmlns:pic="http://schemas.openxmlformats.org/drawingml/2006/picture">
-            <wp:extent cx="4944745" cy="2856865"/>
+            <wp:extent cx="4989195" cy="2494597"/>
             <wp:docPr id="2000" name="Picture 1028"/>
             <wp:cNvGraphicFramePr>
               <a:graphicFrameLocks noChangeAspect="1"/>
@@ -1873,7 +1873,7 @@
                   <pic:spPr>
                     <a:xfrm>
                       <a:off x="0" y="0"/>
-                      <a:ext cx="4944745" cy="2856865"/>
+                      <a:ext cx="4989195" cy="2494597"/>
                     </a:xfrm>
                     <a:prstGeom prst="rect"/>
                   </pic:spPr>
@@ -1918,7 +1918,7 @@
           <w:rFonts w:ascii="HY중고딕" w:eastAsia="HY중고딕" w:hAnsi="HY중고딕" w:hint="default"/>
           <w:i/>
         </w:rPr>
-        <w:t xml:space="preserve">주(Note): 본 그림은 전체 응답자(N=75)의 골프 실력 수준 분포를 시각화한 것이다. 비기너부터 투어 프로까지 다양한 수준이 포함되어 있으며, 중급자와 고수 집단이 상대적으로 높은 비중을 차지하였다.</w:t>
+        <w:t xml:space="preserve">주(Note): 본 그림은 전체 응답자(N=75)의 골프 실력 수준 분포를 시각화한 것이다. 비기너부터 투어 프로까지 다양한 수준이 포함되어 있으며, 중급자와 비기너 집단이 상대적으로 높은 비중을 차지하였다.</w:t>
       </w:r>
     </w:p>
     <w:p>
@@ -4031,7 +4031,7 @@
         </w:rPr>
       </w:pPr>
       <w:r>
-        <w:t xml:space="preserve">그러나 각 실력 그룹의 세부 평균값을 시각화 하여 탐색적으로 분석한 결과, 일부 변수에서 가설 1의 방향성과 유사한 변화 경향이 관찰되었다. 첫째, 흐름에 몸을 맡기는 '무위' 점수는 비기너와 프로 집단에서 높고 통제 강박이 심해지는 중급자 구간에서 하락하는 비선형적 </w:t>
+        <w:t xml:space="preserve">그러나 각 실력 그룹의 세부 평균값을 시각화 하여 탐색적으로 분석한 결과, 일부 변수에서 가설 1의 방향성과 유사한 변화 경향이 관찰되었다. 첫째, 흐름에 몸을 맡기는 '무위' 점수는 비기너 집단(3.88)에서 높게 나타난 뒤 중급자(3.65), 고수(3.43)를 거쳐 티칭 프로(2.67) 구간까지 하락하였다가 투어 프로 집단(4.25)에서 다시 가장 높아지는 비선형적 </w:t>
       </w:r>
       <w:r>
         <w:rPr>
@@ -4054,7 +4054,7 @@
       <w:r>
         <w:drawing>
           <wp:inline xmlns:a="http://schemas.openxmlformats.org/drawingml/2006/main" xmlns:pic="http://schemas.openxmlformats.org/drawingml/2006/picture">
-            <wp:extent cx="4731385" cy="2677795"/>
+            <wp:extent cx="4989195" cy="2494597"/>
             <wp:docPr id="2001" name="Picture 1028"/>
             <wp:cNvGraphicFramePr>
               <a:graphicFrameLocks noChangeAspect="1"/>
@@ -4075,7 +4075,7 @@
                   <pic:spPr>
                     <a:xfrm>
                       <a:off x="0" y="0"/>
-                      <a:ext cx="4731385" cy="2677795"/>
+                      <a:ext cx="4989195" cy="2494597"/>
                     </a:xfrm>
                     <a:prstGeom prst="rect"/>
                   </pic:spPr>
@@ -4133,7 +4133,7 @@
         </w:rPr>
       </w:pPr>
       <w:r>
-        <w:t xml:space="preserve">둘째, 실력 수준이 비기너에서 투어 프로 집단으로 증가할수록, 샷 직전 잡념을 비우는 ‘허정(Emptiness)’ 점수는 전반적으로 완만한 증가 경향을 보이는 양상이 관찰되었다(그림 3). 그러나 본 연구에서는 통계적 유의수준(p &lt; 0.05)을 충족하지 못하였으므로, 이러한 변화는 통계적으로 유의한 증가로 해석하기에는 제한이 있다. 다만 실력 수준에 따라 점진적인 변화 양상이 나타난 점은 향후 추가 표본 확보를 통한 후속 연구에서 탐색적으로 검증될 필요가 있다.</w:t>
+        <w:t xml:space="preserve">둘째, 실력 수준이 비기너에서 투어 프로 집단으로 증가할수록, 샷 직전 잡념을 비우는 ‘허정(Emptiness)’ 점수는 티칭 프로 집단(2.83)을 제외하면 비기너(2.50), 중급자(2.83), 고수(3.17), 투어 프로(3.62) 순으로 전반적으로 완만한 증가 경향을 보이는 양상이 관찰되었다(그림 3). 그러나 본 연구에서는 통계적 유의수준(p &lt; 0.05)을 충족하지 못하였으므로, 이러한 변화는 통계적으로 유의한 증가로 해석하기에는 제한이 있다. 다만 실력 수준에 따라 점진적인 변화 양상이 나타난 점은 향후 추가 표본 확보를 통한 후속 연구에서 탐색적으로 검증될 필요가 있다.</w:t>
       </w:r>
     </w:p>
     <w:p>
@@ -4146,7 +4146,7 @@
         </w:rPr>
       </w:pPr>
       <w:r>
-        <w:t xml:space="preserve">셋째, 무아지경 상태를 의미하는 ‘플로우(Flow)’ 점수 역시 실력 수준이 증가함에 따라 전반적으로 상승하는 경향을 보이는 양상이 관찰되었다(그림 4). 그러나 이러한 변화 또한 통계적으로 유의한 수준에는 도달하지 못하였으므로, 결과 해석에는 신중한 접근이 필요하다. 그럼에도 불구하고 실력 수준에 따라 일정한 변화 양상이 나타난 점은 향후 후속 연구에서 추가적으로 탐색해 볼 수 있는 가능성을 제시한다.</w:t>
+        <w:t xml:space="preserve">셋째, 무아지경 상태를 의미하는 ‘플로우(Flow)’ 점수 역시 비기너(3.32), 중급자(3.51), 고수(3.73), 티칭 프로(3.67), 투어 프로(4.25)로 실력 수준이 증가함에 따라 전반적으로 상승하는 경향을 보이는 양상이 관찰되었다(그림 4). 그러나 이러한 변화 또한 통계적으로 유의한 수준에는 도달하지 못하였으므로, 결과 해석에는 신중한 접근이 필요하다. 그럼에도 불구하고 실력 수준에 따라 일정한 변화 양상이 나타난 점은 향후 후속 연구에서 추가적으로 탐색해 볼 수 있는 가능성을 제시한다.</w:t>
       </w:r>
     </w:p>
     <w:p>
@@ -4160,7 +4160,7 @@
       <w:r>
         <w:drawing>
           <wp:inline xmlns:a="http://schemas.openxmlformats.org/drawingml/2006/main" xmlns:pic="http://schemas.openxmlformats.org/drawingml/2006/picture">
-            <wp:extent cx="4617720" cy="2501900"/>
+            <wp:extent cx="4989195" cy="2494597"/>
             <wp:docPr id="2002" name="Picture 1028"/>
             <wp:cNvGraphicFramePr>
               <a:graphicFrameLocks noChangeAspect="1"/>
@@ -4181,7 +4181,7 @@
                   <pic:spPr>
                     <a:xfrm>
                       <a:off x="0" y="0"/>
-                      <a:ext cx="4617720" cy="2501900"/>
+                      <a:ext cx="4989195" cy="2494597"/>
                     </a:xfrm>
                     <a:prstGeom prst="rect"/>
                   </pic:spPr>
@@ -4211,7 +4211,7 @@
         <w:rPr>
           <w:rFonts w:ascii="HY중고딕" w:eastAsia="HY중고딕" w:hAnsi="HY중고딕" w:hint="default"/>
         </w:rPr>
-        <w:t xml:space="preserve"> 골프 실력 수준에 따른 허정(Emptiness)의 선형적 증가 추이</w:t>
+        <w:t xml:space="preserve"> 골프 실력 수준에 따른 허정(Emptiness)의 변화 추이</w:t>
       </w:r>
     </w:p>
     <w:p>
@@ -4240,7 +4240,7 @@
       <w:r>
         <w:drawing>
           <wp:inline xmlns:a="http://schemas.openxmlformats.org/drawingml/2006/main" xmlns:pic="http://schemas.openxmlformats.org/drawingml/2006/picture">
-            <wp:extent cx="4606925" cy="2493010"/>
+            <wp:extent cx="4989195" cy="2494597"/>
             <wp:docPr id="2003" name="Picture 1028"/>
             <wp:cNvGraphicFramePr>
               <a:graphicFrameLocks noChangeAspect="1"/>
@@ -4261,7 +4261,7 @@
                   <pic:spPr>
                     <a:xfrm>
                       <a:off x="0" y="0"/>
-                      <a:ext cx="4606925" cy="2493010"/>
+                      <a:ext cx="4989195" cy="2494597"/>
                     </a:xfrm>
                     <a:prstGeom prst="rect"/>
                   </pic:spPr>
@@ -4291,7 +4291,7 @@
         <w:rPr>
           <w:rFonts w:ascii="HY중고딕" w:eastAsia="HY중고딕" w:hAnsi="HY중고딕" w:hint="default"/>
         </w:rPr>
-        <w:t xml:space="preserve"> 골프 실력 수준에 따른 플로우(Flow)의 선형적 증가 추이</w:t>
+        <w:t xml:space="preserve"> 골프 실력 수준에 따른 플로우(Flow)의 변화 추이</w:t>
       </w:r>
     </w:p>
     <w:p>
@@ -5337,7 +5337,7 @@
           <w:rFonts w:ascii="HY중고딕" w:eastAsia="HY중고딕" w:hAnsi="HY중고딕" w:hint="default"/>
           <w:i/>
         </w:rPr>
-        <w:t xml:space="preserve">주(Note): 허정 지수의 중앙값을 기준으로 낮은 집단과 높은 집단을 분류하여 평균을 산출함.</w:t>
+        <w:t xml:space="preserve">주(Note): 허정 지수의 중앙값(3.0)을 기준으로 중앙값 미만(n = 35)을 낮은 집단, 이상(n = 40)을 높은 집단으로 분류하여 평균을 산출함.</w:t>
       </w:r>
     </w:p>
     <w:p>
@@ -5468,10 +5468,13 @@
         <w:rPr>
           <w:b/>
         </w:rPr>
-        <w:t xml:space="preserve">허정(Emptiness)’은 핸디캡과 유의미한 음(-)의 관련성을 나타냈다. (B = -2.694, β = -0.387, p = .001).</w:t>
+        <w:t xml:space="preserve">허정(Emptiness)’은 핸디캡과 유의미한 음(-)의 관련성을 나타냈다. (B = -2.694, β = -0.387, p &lt; .001).</w:t>
       </w:r>
       <w:r>
         <w:t xml:space="preserve"> 비표준화 회귀계수(B)의 해석에 따르면, 골프 구력이 동일하다고 가정할 때 허정 점수가 1점 증가할수록 평균 핸디캡은 약 2.69 낮아지는 경향이 있는 것으로 나타났다.</w:t>
+      </w:r>
+      <w:r>
+        <w:t xml:space="preserve"> 한편 무위(Wu-wei)는 구력과 다른 심리 변인을 통제한 상태에서 핸디캡과 유의한 양(+)의 관련성을 보였다(B = 1.639, β = 0.263, p = .017). 이는 단순 상관분석에서는 무위와 핸디캡 간 유의한 관련성이 나타나지 않았던 것과 달리, 허정 등을 함께 고려하면 무위 성향이 높을수록 핸디캡이 높은(퍼포먼스가 낮은) 경향이 있음을 의미한다. 유약(Softness)은 유의한 관련성을 보이지 않았다(B = -0.033, β = -0.004, p = .968).</w:t>
       </w:r>
     </w:p>
     <w:p>
@@ -5819,7 +5822,7 @@
                 <w:spacing w:val="-6"/>
                 <w:w w:val="95"/>
               </w:rPr>
-              <w:t xml:space="preserve">1.42</w:t>
+              <w:t xml:space="preserve">1.00</w:t>
             </w:r>
           </w:p>
         </w:tc>
@@ -5873,7 +5876,7 @@
                 <w:spacing w:val="-6"/>
                 <w:w w:val="95"/>
               </w:rPr>
-              <w:t xml:space="preserve">0.12</w:t>
+              <w:t xml:space="preserve">1.639</w:t>
             </w:r>
           </w:p>
         </w:tc>
@@ -5951,7 +5954,7 @@
                 <w:spacing w:val="-6"/>
                 <w:w w:val="95"/>
               </w:rPr>
-              <w:t xml:space="preserve">1.31</w:t>
+              <w:t xml:space="preserve">1.42</w:t>
             </w:r>
           </w:p>
         </w:tc>
@@ -6005,7 +6008,7 @@
                 <w:spacing w:val="-6"/>
                 <w:w w:val="95"/>
               </w:rPr>
-              <w:t xml:space="preserve">-0.05</w:t>
+              <w:t xml:space="preserve">-0.033</w:t>
             </w:r>
           </w:p>
         </w:tc>
@@ -6083,7 +6086,7 @@
                 <w:spacing w:val="-6"/>
                 <w:w w:val="95"/>
               </w:rPr>
-              <w:t xml:space="preserve">1.28</w:t>
+              <w:t xml:space="preserve">1.36</w:t>
             </w:r>
           </w:p>
         </w:tc>
@@ -6189,7 +6192,7 @@
                 <w:spacing w:val="-6"/>
                 <w:w w:val="95"/>
               </w:rPr>
-              <w:t xml:space="preserve">0.001**</w:t>
+              <w:t xml:space="preserve">&lt; .001***</w:t>
             </w:r>
           </w:p>
         </w:tc>
@@ -6215,7 +6218,7 @@
                 <w:spacing w:val="-6"/>
                 <w:w w:val="95"/>
               </w:rPr>
-              <w:t xml:space="preserve">1.57</w:t>
+              <w:t xml:space="preserve">1.41</w:t>
             </w:r>
           </w:p>
         </w:tc>
@@ -6318,7 +6321,10 @@
         <w:t xml:space="preserve">그러나 실력 수준에 따른 집단 비교 분석 결과, '무위' 성향은 매우 흥미로운 비선형적 'U자형(U-shaped)' 발달 추이를 나타냈다.</w:t>
       </w:r>
       <w:r>
-        <w:t xml:space="preserve"> 초보자의 수동적 체념(높은 무위 점수)에서 시작한 철학적 태도는, 스윙을 억지로 통제하려는 강박이 정점에 달하는 중급자 및 티칭 프로 단계에서 최저점으로 하락하였다. 하지만 기술적 통제의 한계를 넘어선 투어 프로 단계에 이르러서는 다시 자연의 흐름에 샷을 온전히 맡기는 '능동적이고 진정한 무위'로 회귀하며 최고점으로 급상승하였다. 이는 무위가 단순한 타수 감소 변수가 아니라, 골퍼가 인위적 통제의 한계를 극복하고 최상위 경지로 나아가기 위해 반드시 겪어야 하는 심리적 발달 과정(U자형 곡선)의 중요한 해석적 시사점을 제공한다.</w:t>
+        <w:t xml:space="preserve"> 초보자의 수동적 체념(높은 무위 점수)에서 시작한 철학적 태도는, 스윙을 억지로 통제하려는 강박이 커지는 중급자·고수 단계를 거치며 점차 하락하여 티칭 프로 단계에서 최저점에 이르렀다. 하지만 기술적 통제의 한계를 넘어선 투어 프로 단계에 이르러서는 다시 자연의 흐름에 샷을 온전히 맡기는 '능동적이고 진정한 무위'로 회귀하며 최고점으로 급상승하였다. 이는 무위가 단순한 타수 감소 변수가 아니라, 골퍼가 인위적 통제의 한계를 극복하고 최상위 경지로 나아가기 위해 반드시 겪어야 하는 심리적 발달 과정(U자형 곡선)의 중요한 해석적 시사점을 제공한다.</w:t>
+      </w:r>
+      <w:r>
+        <w:t xml:space="preserve"> 또한 다중회귀분석에서 무위는 허정 등을 통제한 상태에서 핸디캡과 유의한 양(+)의 관련성을 보였는데(β = 0.263, p = .017), 이는 초보자 집단의 높은 무위 점수와 같이 무위 문항이 능동적 수용뿐 아니라 수동적 체념을 함께 반영했을 가능성을 시사하므로 해석에 주의가 필요하다.</w:t>
       </w:r>
     </w:p>
     <w:p>
@@ -6340,7 +6346,7 @@
         <w:t xml:space="preserve">'허정(Emptiness)'의 태도는 골프 퍼포먼스와 유의미한 통계적 관련성</w:t>
       </w:r>
       <w:r>
-        <w:t xml:space="preserve">을 보였다. 실력이 상급자로 갈수록 허정을 실천하는 빈도가 뚜렷하게 증가하였으며, 평균 타수 및 핸디캡 모두와 유의미한 음(-)의 상관관계를 나타냈다. 특히, 핸디캡에 가장 결정적인 영향을 미치는 물리적 요인인 '구력(경험)'을 통제한 다중회귀분석에서도 허정은 핸디캡을 유의미하게 낮추는 독립 변인으로 확인되었다(허정 점수 1점 상승 시 핸디캡 약 2.69타 감소). 이는 동양철학의 '비움'이라는 추상적 개념이 실제 스포츠 현장에서 타수를 줄이는 구체적이고 강력한 멘탈리티 전략임을 데이터를 통해 유의미한 관련성이 관찰되었다는 점에서 의의가 있다.</w:t>
+        <w:t xml:space="preserve">을 보였다. 실력이 상급자로 갈수록 허정 점수가 전반적으로 높아지는 경향을 보였으며(통계적으로 유의하지는 않음), 평균 타수 및 핸디캡 모두와 유의미한 음(-)의 상관관계를 나타냈다. 특히, 핸디캡에 가장 결정적인 영향을 미치는 물리적 요인인 '구력(경험)'을 통제한 다중회귀분석에서도 허정은 핸디캡을 유의미하게 낮추는 독립 변인으로 확인되었다(허정 점수 1점 상승 시 핸디캡 약 2.69타 감소). 이는 동양철학의 '비움'이라는 추상적 개념이 실제 스포츠 현장에서 타수를 줄이는 구체적이고 강력한 멘탈리티 전략임을 데이터를 통해 유의미한 관련성이 관찰되었다는 점에서 의의가 있다.</w:t>
       </w:r>
     </w:p>
     <w:p>

</xml_diff>

<commit_message>
Use merged pro group (teaching+tour) for ANOVA, figures, and discussion
Co-Authored-By: Claude Opus 5.5 <noreply@anthropic.com>
Claude-Session: https://claude.ai/code/session_01Mr5vHFAEvsGoTDLMY2BMvt
</commit_message>
<xml_diff>
--- a/JCR_도덕경_골프퍼포먼스_템플릿적용.docx
+++ b/JCR_도덕경_골프퍼포먼스_템플릿적용.docx
@@ -4018,7 +4018,7 @@
         </w:rPr>
       </w:pPr>
       <w:r>
-        <w:t xml:space="preserve">실력 수준에 따른 집단 간 평균 차이를 확인하기 위해 일원분산분석(One-way ANOVA)을 실시하였다. 분석 결과, 무위(F=1.122, p=0.353), 허정(F=1.430, p=0.233), 플로우(F=1.066, p=0.380) 등 모든 변수의 P-value가 0.05를 넘겨 엄격한 통계적 유의성은 충족하지 못하였다. 이는 최상위 프로 집단의 표본 수가 상대적으로 부족한 통계적 한계에서 기인한 것으로 파악된다.</w:t>
+        <w:t xml:space="preserve">실력 수준에 따른 집단 간 평균 차이를 확인하기 위해 일원분산분석(One-way ANOVA)을 실시하였다. 이때 티칭 프로(n = 3)와 투어 프로(n = 4)는 표본 수가 적어 프로 집단(n = 7)으로 통합하여 비기너, 중급자, 고수, 프로의 4개 집단으로 비교하였다. 분석 결과, 무위(F=0.405, p=0.750), 허정(F=1.563, p=0.206), 플로우(F=1.184, p=0.322) 등 모든 변수의 P-value가 0.05를 넘겨 엄격한 통계적 유의성은 충족하지 못하였다. 이는 최상위 프로 집단의 표본 수가 상대적으로 부족한 통계적 한계에서 기인한 것으로 파악된다.</w:t>
       </w:r>
     </w:p>
     <w:p>
@@ -4031,7 +4031,7 @@
         </w:rPr>
       </w:pPr>
       <w:r>
-        <w:t xml:space="preserve">그러나 각 실력 그룹의 세부 평균값을 시각화 하여 탐색적으로 분석한 결과, 일부 변수에서 가설 1의 방향성과 유사한 변화 경향이 관찰되었다. 첫째, 흐름에 몸을 맡기는 '무위' 점수는 비기너 집단(3.88)에서 높게 나타난 뒤 중급자(3.65), 고수(3.43)를 거쳐 티칭 프로(2.67) 구간까지 하락하였다가 투어 프로 집단(4.25)에서 다시 가장 높아지는 비선형적 </w:t>
+        <w:t xml:space="preserve">그러나 각 실력 그룹의 세부 평균값을 시각화 하여 탐색적으로 분석한 결과, 일부 변수에서 가설 1의 방향성과 유사한 변화 경향이 관찰되었다. 첫째, 흐름에 몸을 맡기는 '무위' 점수는 비기너 집단(3.88)에서 가장 높게 나타난 뒤 중급자(3.65), 고수(3.43)로 갈수록 낮아졌다가 프로 집단(3.57)에서 소폭 반등하는 완만한 비선형적 </w:t>
       </w:r>
       <w:r>
         <w:rPr>
@@ -4105,7 +4105,7 @@
         <w:rPr>
           <w:rFonts w:ascii="HY중고딕" w:eastAsia="HY중고딕" w:hAnsi="HY중고딕" w:hint="default"/>
         </w:rPr>
-        <w:t xml:space="preserve"> 골프 실력 수준에 따른 무위(Wu-wei) 성향의 U자형 변화 추이</w:t>
+        <w:t xml:space="preserve"> 골프 실력 수준에 따른 무위(Wu-wei) 성향의 변화 추이</w:t>
       </w:r>
     </w:p>
     <w:p>
@@ -4133,7 +4133,7 @@
         </w:rPr>
       </w:pPr>
       <w:r>
-        <w:t xml:space="preserve">둘째, 실력 수준이 비기너에서 투어 프로 집단으로 증가할수록, 샷 직전 잡념을 비우는 ‘허정(Emptiness)’ 점수는 티칭 프로 집단(2.83)을 제외하면 비기너(2.50), 중급자(2.83), 고수(3.17), 투어 프로(3.62) 순으로 전반적으로 완만한 증가 경향을 보이는 양상이 관찰되었다(그림 3). 그러나 본 연구에서는 통계적 유의수준(p &lt; 0.05)을 충족하지 못하였으므로, 이러한 변화는 통계적으로 유의한 증가로 해석하기에는 제한이 있다. 다만 실력 수준에 따라 점진적인 변화 양상이 나타난 점은 향후 추가 표본 확보를 통한 후속 연구에서 탐색적으로 검증될 필요가 있다.</w:t>
+        <w:t xml:space="preserve">둘째, 실력 수준이 비기너에서 프로 집단으로 증가할수록, 샷 직전 잡념을 비우는 ‘허정(Emptiness)’ 점수는 비기너(2.50), 중급자(2.83), 고수(3.17), 프로(3.29) 순으로 완만한 증가 경향을 보이는 양상이 관찰되었다(그림 3). 그러나 본 연구에서는 통계적 유의수준(p &lt; 0.05)을 충족하지 못하였으므로, 이러한 변화는 통계적으로 유의한 증가로 해석하기에는 제한이 있다. 다만 실력 수준에 따라 점진적인 변화 양상이 나타난 점은 향후 추가 표본 확보를 통한 후속 연구에서 탐색적으로 검증될 필요가 있다.</w:t>
       </w:r>
     </w:p>
     <w:p>
@@ -4146,7 +4146,7 @@
         </w:rPr>
       </w:pPr>
       <w:r>
-        <w:t xml:space="preserve">셋째, 무아지경 상태를 의미하는 ‘플로우(Flow)’ 점수 역시 비기너(3.32), 중급자(3.51), 고수(3.73), 티칭 프로(3.67), 투어 프로(4.25)로 실력 수준이 증가함에 따라 전반적으로 상승하는 경향을 보이는 양상이 관찰되었다(그림 4). 그러나 이러한 변화 또한 통계적으로 유의한 수준에는 도달하지 못하였으므로, 결과 해석에는 신중한 접근이 필요하다. 그럼에도 불구하고 실력 수준에 따라 일정한 변화 양상이 나타난 점은 향후 후속 연구에서 추가적으로 탐색해 볼 수 있는 가능성을 제시한다.</w:t>
+        <w:t xml:space="preserve">셋째, 무아지경 상태를 의미하는 ‘플로우(Flow)’ 점수 역시 비기너(3.32), 중급자(3.51), 고수(3.73), 프로(4.00)로 실력 수준이 증가함에 따라 전반적으로 상승하는 경향을 보이는 양상이 관찰되었다(그림 4). 그러나 이러한 변화 또한 통계적으로 유의한 수준에는 도달하지 못하였으므로, 결과 해석에는 신중한 접근이 필요하다. 그럼에도 불구하고 실력 수준에 따라 일정한 변화 양상이 나타난 점은 향후 후속 연구에서 추가적으로 탐색해 볼 수 있는 가능성을 제시한다.</w:t>
       </w:r>
     </w:p>
     <w:p>
@@ -4211,7 +4211,7 @@
         <w:rPr>
           <w:rFonts w:ascii="HY중고딕" w:eastAsia="HY중고딕" w:hAnsi="HY중고딕" w:hint="default"/>
         </w:rPr>
-        <w:t xml:space="preserve"> 골프 실력 수준에 따른 허정(Emptiness)의 변화 추이</w:t>
+        <w:t xml:space="preserve"> 골프 실력 수준에 따른 허정(Emptiness)의 증가 추이</w:t>
       </w:r>
     </w:p>
     <w:p>
@@ -4291,7 +4291,7 @@
         <w:rPr>
           <w:rFonts w:ascii="HY중고딕" w:eastAsia="HY중고딕" w:hAnsi="HY중고딕" w:hint="default"/>
         </w:rPr>
-        <w:t xml:space="preserve"> 골프 실력 수준에 따른 플로우(Flow)의 변화 추이</w:t>
+        <w:t xml:space="preserve"> 골프 실력 수준에 따른 플로우(Flow)의 증가 추이</w:t>
       </w:r>
     </w:p>
     <w:p>
@@ -6318,10 +6318,10 @@
         <w:rPr>
           <w:b/>
         </w:rPr>
-        <w:t xml:space="preserve">그러나 실력 수준에 따른 집단 비교 분석 결과, '무위' 성향은 매우 흥미로운 비선형적 'U자형(U-shaped)' 발달 추이를 나타냈다.</w:t>
-      </w:r>
-      <w:r>
-        <w:t xml:space="preserve"> 초보자의 수동적 체념(높은 무위 점수)에서 시작한 철학적 태도는, 스윙을 억지로 통제하려는 강박이 커지는 중급자·고수 단계를 거치며 점차 하락하여 티칭 프로 단계에서 최저점에 이르렀다. 하지만 기술적 통제의 한계를 넘어선 투어 프로 단계에 이르러서는 다시 자연의 흐름에 샷을 온전히 맡기는 '능동적이고 진정한 무위'로 회귀하며 최고점으로 급상승하였다. 이는 무위가 단순한 타수 감소 변수가 아니라, 골퍼가 인위적 통제의 한계를 극복하고 최상위 경지로 나아가기 위해 반드시 겪어야 하는 심리적 발달 과정(U자형 곡선)의 중요한 해석적 시사점을 제공한다.</w:t>
+        <w:t xml:space="preserve">그러나 실력 수준에 따른 집단 비교 분석 결과, '무위' 성향은 완만한 비선형적 'U자형(U-shaped)' 경향을 나타냈다(통계적으로 유의하지는 않음).</w:t>
+      </w:r>
+      <w:r>
+        <w:t xml:space="preserve"> 초보자의 수동적 체념(높은 무위 점수)에서 시작한 철학적 태도는, 스윙을 억지로 통제하려는 강박이 커지는 중급자·고수 단계를 거치며 점차 하락하여 고수 단계에서 최저점(3.43)에 이르렀다. 하지만 기술적 통제의 한계를 넘어선 프로 단계에서는 다시 반등하여(3.57), 자연의 흐름에 샷을 맡기는 '능동적인 무위'로 회귀할 가능성을 보여주었다. 이는 무위가 단순한 타수 감소 변수가 아니라, 골퍼가 인위적 통제의 한계를 극복하고 최상위 경지로 나아가기 위해 겪을 수 있는 심리적 발달 과정(U자형 곡선)의 중요한 해석적 시사점을 제공한다.</w:t>
       </w:r>
       <w:r>
         <w:t xml:space="preserve"> 또한 다중회귀분석에서 무위는 허정 등을 통제한 상태에서 핸디캡과 유의한 양(+)의 관련성을 보였는데(β = 0.263, p = .017), 이는 초보자 집단의 높은 무위 점수와 같이 무위 문항이 능동적 수용뿐 아니라 수동적 체념을 함께 반영했을 가능성을 시사하므로 해석에 주의가 필요하다.</w:t>
@@ -6553,7 +6553,7 @@
         <w:t xml:space="preserve">표본 크기에 따른 그룹 간 비교(ANOVA)의 한계:</w:t>
       </w:r>
       <w:r>
-        <w:t xml:space="preserve"> 75명의 표본 중 본 연구에서는 티칭 프로와 투어 프로 집단의 표본 수가 각각 3명과 4명으로 제한적이었다. 따라서 실력 수준별 평균 차이를 비교하는 ANOVA 결과는 표본 불균형의 영향을 받을 수 있으며, 본 연구의 집단 간 비교 결과는 확정적 결론이 아니라 탐색적 결과로 해석하는 것이 타당하다. 향후 연구에서는 각 실력 수준별로 충분하고 균형 잡힌 층화 표본을 확보하여 실력에 따른 멘탈리티의 차이를 더욱 명확히 검증해야 할 것이다.</w:t>
+        <w:t xml:space="preserve"> 75명의 표본 중 본 연구에서는 티칭 프로와 투어 프로 집단의 표본 수가 각각 3명과 4명으로 제한적이어서, 두 집단을 프로 집단(n = 7)으로 통합하여 분석하였다. 따라서 실력 수준별 평균 차이를 비교하는 ANOVA 결과는 표본 불균형의 영향을 받을 수 있으며, 본 연구의 집단 간 비교 결과는 확정적 결론이 아니라 탐색적 결과로 해석하는 것이 타당하다. 향후 연구에서는 각 실력 수준별로 충분하고 균형 잡힌 층화 표본을 확보하여 실력에 따른 멘탈리티의 차이를 더욱 명확히 검증해야 할 것이다.</w:t>
       </w:r>
     </w:p>
     <w:p>

</xml_diff>